<commit_message>
fixing docs and some changes
</commit_message>
<xml_diff>
--- a/SO_assesment/SO_assessment_guide_v1.docx
+++ b/SO_assesment/SO_assessment_guide_v1.docx
@@ -108,16 +108,7 @@
               <w:rFonts w:asciiTheme="minorHAnsi" w:hAnsiTheme="minorHAnsi" w:cstheme="minorHAnsi"/>
               <w:color w:val="000000" w:themeColor="text1"/>
             </w:rPr>
-            <w:t>Con</w:t>
-          </w:r>
-          <w:bookmarkStart w:id="1" w:name="_GoBack"/>
-          <w:bookmarkEnd w:id="1"/>
-          <w:r>
-            <w:rPr>
-              <w:rFonts w:asciiTheme="minorHAnsi" w:hAnsiTheme="minorHAnsi" w:cstheme="minorHAnsi"/>
-              <w:color w:val="000000" w:themeColor="text1"/>
-            </w:rPr>
-            <w:t>tents</w:t>
+            <w:t>Contents</w:t>
           </w:r>
         </w:p>
         <w:p>
@@ -1362,7 +1353,7 @@
           <w:color w:val="000000" w:themeColor="text1"/>
         </w:rPr>
       </w:pPr>
-      <w:bookmarkStart w:id="2" w:name="_Toc108593717"/>
+      <w:bookmarkStart w:id="1" w:name="_Toc108593717"/>
       <w:r>
         <w:rPr>
           <w:rFonts w:asciiTheme="minorHAnsi" w:hAnsiTheme="minorHAnsi" w:cstheme="minorHAnsi"/>
@@ -1371,7 +1362,7 @@
         <w:lastRenderedPageBreak/>
         <w:t>Useful documents</w:t>
       </w:r>
-      <w:bookmarkEnd w:id="2"/>
+      <w:bookmarkEnd w:id="1"/>
     </w:p>
     <w:p>
       <w:pPr>
@@ -1530,7 +1521,7 @@
           <w:color w:val="000000" w:themeColor="text1"/>
         </w:rPr>
       </w:pPr>
-      <w:bookmarkStart w:id="3" w:name="_Toc108593718"/>
+      <w:bookmarkStart w:id="2" w:name="_Toc108593718"/>
       <w:r>
         <w:rPr>
           <w:rFonts w:asciiTheme="minorHAnsi" w:hAnsiTheme="minorHAnsi" w:cstheme="minorHAnsi"/>
@@ -1552,7 +1543,7 @@
         </w:rPr>
         <w:t>ntroduction to Argo regional quality assessment in the Southern Ocean</w:t>
       </w:r>
-      <w:bookmarkEnd w:id="3"/>
+      <w:bookmarkEnd w:id="2"/>
     </w:p>
     <w:p>
       <w:pPr>
@@ -2251,7 +2242,6 @@
           <w:noProof/>
           <w:color w:val="000000" w:themeColor="text1"/>
         </w:rPr>
-        <w:lastRenderedPageBreak/>
         <w:drawing>
           <wp:inline distT="0" distB="0" distL="0" distR="0" wp14:anchorId="7035E0C6" wp14:editId="5FF8EA0B">
             <wp:extent cx="5926455" cy="3437890"/>
@@ -2312,7 +2302,7 @@
           <w:color w:val="000000" w:themeColor="text1"/>
         </w:rPr>
       </w:pPr>
-      <w:bookmarkStart w:id="4" w:name="_Toc108593719"/>
+      <w:bookmarkStart w:id="3" w:name="_Toc108593719"/>
       <w:r>
         <w:rPr>
           <w:rFonts w:asciiTheme="minorHAnsi" w:hAnsiTheme="minorHAnsi" w:cstheme="minorHAnsi"/>
@@ -2320,7 +2310,7 @@
         </w:rPr>
         <w:t>Location of code directories</w:t>
       </w:r>
-      <w:bookmarkEnd w:id="4"/>
+      <w:bookmarkEnd w:id="3"/>
     </w:p>
     <w:p>
       <w:pPr>
@@ -2644,25 +2634,25 @@
           <w:i/>
           <w:color w:val="000000" w:themeColor="text1"/>
         </w:rPr>
-        <w:t>&gt;</w:t>
-      </w:r>
-      <w:proofErr w:type="gramStart"/>
+        <w:t>&gt;&gt;  /users/</w:t>
+      </w:r>
+      <w:proofErr w:type="spellStart"/>
       <w:r>
         <w:rPr>
           <w:rFonts w:cstheme="minorHAnsi"/>
           <w:i/>
           <w:color w:val="000000" w:themeColor="text1"/>
         </w:rPr>
-        <w:t>&gt;  /</w:t>
-      </w:r>
-      <w:proofErr w:type="gramEnd"/>
+        <w:t>argo</w:t>
+      </w:r>
+      <w:proofErr w:type="spellEnd"/>
       <w:r>
         <w:rPr>
           <w:rFonts w:cstheme="minorHAnsi"/>
           <w:i/>
           <w:color w:val="000000" w:themeColor="text1"/>
         </w:rPr>
-        <w:t>users/</w:t>
+        <w:t>/</w:t>
       </w:r>
       <w:proofErr w:type="spellStart"/>
       <w:r>
@@ -2671,7 +2661,7 @@
           <w:i/>
           <w:color w:val="000000" w:themeColor="text1"/>
         </w:rPr>
-        <w:t>argo</w:t>
+        <w:t>dm_qc</w:t>
       </w:r>
       <w:proofErr w:type="spellEnd"/>
       <w:r>
@@ -2689,7 +2679,7 @@
           <w:i/>
           <w:color w:val="000000" w:themeColor="text1"/>
         </w:rPr>
-        <w:t>dm_qc</w:t>
+        <w:t>SO_assesment</w:t>
       </w:r>
       <w:proofErr w:type="spellEnd"/>
       <w:r>
@@ -2698,155 +2688,119 @@
           <w:i/>
           <w:color w:val="000000" w:themeColor="text1"/>
         </w:rPr>
-        <w:t>/</w:t>
-      </w:r>
-      <w:proofErr w:type="spellStart"/>
-      <w:r>
+        <w:t>/DMQC-PCM-main</w:t>
+      </w:r>
+    </w:p>
+    <w:p>
+      <w:pPr>
+        <w:rPr>
+          <w:rFonts w:cstheme="minorHAnsi"/>
+          <w:b/>
+          <w:color w:val="000000" w:themeColor="text1"/>
+        </w:rPr>
+      </w:pPr>
+    </w:p>
+    <w:p>
+      <w:pPr>
+        <w:rPr>
+          <w:rFonts w:cstheme="minorHAnsi"/>
+          <w:color w:val="000000" w:themeColor="text1"/>
+        </w:rPr>
+      </w:pPr>
+      <w:r>
+        <w:rPr>
+          <w:rFonts w:cstheme="minorHAnsi"/>
+          <w:color w:val="000000" w:themeColor="text1"/>
+        </w:rPr>
+        <w:t>The</w:t>
+      </w:r>
+      <w:r>
+        <w:rPr>
+          <w:rFonts w:cstheme="minorHAnsi"/>
+          <w:color w:val="000000" w:themeColor="text1"/>
+        </w:rPr>
+        <w:t xml:space="preserve"> directory of</w:t>
+      </w:r>
+      <w:r>
+        <w:rPr>
+          <w:rFonts w:cstheme="minorHAnsi"/>
+          <w:color w:val="000000" w:themeColor="text1"/>
+        </w:rPr>
+        <w:t xml:space="preserve"> </w:t>
+      </w:r>
+      <w:r>
+        <w:rPr>
+          <w:rFonts w:cstheme="minorHAnsi"/>
+          <w:color w:val="000000" w:themeColor="text1"/>
+        </w:rPr>
+        <w:t xml:space="preserve">the SO quality assessment </w:t>
+      </w:r>
+      <w:r>
+        <w:rPr>
+          <w:rFonts w:cstheme="minorHAnsi"/>
+          <w:color w:val="000000" w:themeColor="text1"/>
+        </w:rPr>
+        <w:t>software</w:t>
+      </w:r>
+      <w:r>
+        <w:rPr>
+          <w:rFonts w:cstheme="minorHAnsi"/>
+          <w:color w:val="000000" w:themeColor="text1"/>
+        </w:rPr>
+        <w:t xml:space="preserve"> </w:t>
+      </w:r>
+      <w:r>
+        <w:rPr>
+          <w:rFonts w:cstheme="minorHAnsi"/>
+          <w:color w:val="000000" w:themeColor="text1"/>
+        </w:rPr>
+        <w:t>compatible with OWC Python code</w:t>
+      </w:r>
+      <w:r>
+        <w:rPr>
+          <w:rFonts w:cstheme="minorHAnsi"/>
+          <w:color w:val="000000" w:themeColor="text1"/>
+        </w:rPr>
+        <w:t xml:space="preserve"> is as follow</w:t>
+      </w:r>
+      <w:r>
+        <w:rPr>
+          <w:rFonts w:cstheme="minorHAnsi"/>
+          <w:color w:val="000000" w:themeColor="text1"/>
+        </w:rPr>
+        <w:t>s</w:t>
+      </w:r>
+      <w:r>
+        <w:rPr>
+          <w:rFonts w:cstheme="minorHAnsi"/>
+          <w:color w:val="000000" w:themeColor="text1"/>
+        </w:rPr>
+        <w:t>:</w:t>
+      </w:r>
+    </w:p>
+    <w:p>
+      <w:pPr>
+        <w:rPr>
+          <w:rFonts w:cstheme="minorHAnsi"/>
+          <w:color w:val="000000" w:themeColor="text1"/>
+        </w:rPr>
+      </w:pPr>
+    </w:p>
+    <w:p>
+      <w:pPr>
         <w:rPr>
           <w:rFonts w:cstheme="minorHAnsi"/>
           <w:i/>
           <w:color w:val="000000" w:themeColor="text1"/>
         </w:rPr>
-        <w:t>SO_assesment</w:t>
-      </w:r>
-      <w:proofErr w:type="spellEnd"/>
+      </w:pPr>
       <w:r>
         <w:rPr>
           <w:rFonts w:cstheme="minorHAnsi"/>
           <w:i/>
           <w:color w:val="000000" w:themeColor="text1"/>
         </w:rPr>
-        <w:t>/DMQC-PCM-main</w:t>
-      </w:r>
-    </w:p>
-    <w:p>
-      <w:pPr>
-        <w:rPr>
-          <w:rFonts w:cstheme="minorHAnsi"/>
-          <w:b/>
-          <w:color w:val="000000" w:themeColor="text1"/>
-        </w:rPr>
-      </w:pPr>
-    </w:p>
-    <w:p>
-      <w:pPr>
-        <w:rPr>
-          <w:rFonts w:cstheme="minorHAnsi"/>
-          <w:color w:val="000000" w:themeColor="text1"/>
-        </w:rPr>
-      </w:pPr>
-      <w:r>
-        <w:rPr>
-          <w:rFonts w:cstheme="minorHAnsi"/>
-          <w:color w:val="000000" w:themeColor="text1"/>
-        </w:rPr>
-        <w:t>The</w:t>
-      </w:r>
-      <w:r>
-        <w:rPr>
-          <w:rFonts w:cstheme="minorHAnsi"/>
-          <w:color w:val="000000" w:themeColor="text1"/>
-        </w:rPr>
-        <w:t xml:space="preserve"> directory of</w:t>
-      </w:r>
-      <w:r>
-        <w:rPr>
-          <w:rFonts w:cstheme="minorHAnsi"/>
-          <w:color w:val="000000" w:themeColor="text1"/>
-        </w:rPr>
-        <w:t xml:space="preserve"> </w:t>
-      </w:r>
-      <w:r>
-        <w:rPr>
-          <w:rFonts w:cstheme="minorHAnsi"/>
-          <w:color w:val="000000" w:themeColor="text1"/>
-        </w:rPr>
-        <w:t xml:space="preserve">the SO quality assessment </w:t>
-      </w:r>
-      <w:r>
-        <w:rPr>
-          <w:rFonts w:cstheme="minorHAnsi"/>
-          <w:color w:val="000000" w:themeColor="text1"/>
-        </w:rPr>
-        <w:t>software</w:t>
-      </w:r>
-      <w:r>
-        <w:rPr>
-          <w:rFonts w:cstheme="minorHAnsi"/>
-          <w:color w:val="000000" w:themeColor="text1"/>
-        </w:rPr>
-        <w:t xml:space="preserve"> </w:t>
-      </w:r>
-      <w:r>
-        <w:rPr>
-          <w:rFonts w:cstheme="minorHAnsi"/>
-          <w:color w:val="000000" w:themeColor="text1"/>
-        </w:rPr>
-        <w:t>compatible with OWC Python code</w:t>
-      </w:r>
-      <w:r>
-        <w:rPr>
-          <w:rFonts w:cstheme="minorHAnsi"/>
-          <w:color w:val="000000" w:themeColor="text1"/>
-        </w:rPr>
-        <w:t xml:space="preserve"> is as follow</w:t>
-      </w:r>
-      <w:r>
-        <w:rPr>
-          <w:rFonts w:cstheme="minorHAnsi"/>
-          <w:color w:val="000000" w:themeColor="text1"/>
-        </w:rPr>
-        <w:t>s</w:t>
-      </w:r>
-      <w:r>
-        <w:rPr>
-          <w:rFonts w:cstheme="minorHAnsi"/>
-          <w:color w:val="000000" w:themeColor="text1"/>
-        </w:rPr>
-        <w:t>:</w:t>
-      </w:r>
-    </w:p>
-    <w:p>
-      <w:pPr>
-        <w:rPr>
-          <w:rFonts w:cstheme="minorHAnsi"/>
-          <w:color w:val="000000" w:themeColor="text1"/>
-        </w:rPr>
-      </w:pPr>
-    </w:p>
-    <w:p>
-      <w:pPr>
-        <w:rPr>
-          <w:rFonts w:cstheme="minorHAnsi"/>
-          <w:i/>
-          <w:color w:val="000000" w:themeColor="text1"/>
-        </w:rPr>
-      </w:pPr>
-      <w:r>
-        <w:rPr>
-          <w:rFonts w:cstheme="minorHAnsi"/>
-          <w:i/>
-          <w:color w:val="000000" w:themeColor="text1"/>
-        </w:rPr>
-        <w:t>&gt;</w:t>
-      </w:r>
-      <w:proofErr w:type="gramStart"/>
-      <w:r>
-        <w:rPr>
-          <w:rFonts w:cstheme="minorHAnsi"/>
-          <w:i/>
-          <w:color w:val="000000" w:themeColor="text1"/>
-        </w:rPr>
-        <w:t>&gt;  /</w:t>
-      </w:r>
-      <w:proofErr w:type="gramEnd"/>
-      <w:r>
-        <w:rPr>
-          <w:rFonts w:cstheme="minorHAnsi"/>
-          <w:i/>
-          <w:color w:val="000000" w:themeColor="text1"/>
-        </w:rPr>
-        <w:t>users/</w:t>
+        <w:t>&gt;&gt;  /users/</w:t>
       </w:r>
       <w:proofErr w:type="spellStart"/>
       <w:r>
@@ -2924,7 +2878,7 @@
           <w:color w:val="000000" w:themeColor="text1"/>
         </w:rPr>
       </w:pPr>
-      <w:bookmarkStart w:id="5" w:name="_Toc108593720"/>
+      <w:bookmarkStart w:id="4" w:name="_Toc108593720"/>
       <w:r>
         <w:rPr>
           <w:rFonts w:asciiTheme="minorHAnsi" w:hAnsiTheme="minorHAnsi" w:cstheme="minorHAnsi"/>
@@ -2932,370 +2886,465 @@
         </w:rPr>
         <w:t>Configure the processing environment</w:t>
       </w:r>
+      <w:bookmarkEnd w:id="4"/>
+    </w:p>
+    <w:p>
+      <w:pPr>
+        <w:rPr>
+          <w:rFonts w:cstheme="minorHAnsi"/>
+          <w:color w:val="000000" w:themeColor="text1"/>
+        </w:rPr>
+      </w:pPr>
+    </w:p>
+    <w:p>
+      <w:pPr>
+        <w:jc w:val="both"/>
+        <w:rPr>
+          <w:rFonts w:cstheme="minorHAnsi"/>
+          <w:color w:val="000000" w:themeColor="text1"/>
+        </w:rPr>
+      </w:pPr>
+      <w:r>
+        <w:rPr>
+          <w:rFonts w:cstheme="minorHAnsi"/>
+          <w:color w:val="000000" w:themeColor="text1"/>
+        </w:rPr>
+        <w:t xml:space="preserve">The </w:t>
+      </w:r>
+      <w:r>
+        <w:rPr>
+          <w:rFonts w:cstheme="minorHAnsi"/>
+          <w:color w:val="000000" w:themeColor="text1"/>
+        </w:rPr>
+        <w:t>SO quality assessment method operates</w:t>
+      </w:r>
+      <w:r>
+        <w:rPr>
+          <w:rFonts w:cstheme="minorHAnsi"/>
+          <w:color w:val="000000" w:themeColor="text1"/>
+        </w:rPr>
+        <w:t xml:space="preserve"> using python</w:t>
+      </w:r>
+      <w:r>
+        <w:rPr>
+          <w:rFonts w:cstheme="minorHAnsi"/>
+          <w:color w:val="000000" w:themeColor="text1"/>
+        </w:rPr>
+        <w:t>.</w:t>
+      </w:r>
+      <w:r>
+        <w:rPr>
+          <w:rFonts w:cstheme="minorHAnsi"/>
+          <w:color w:val="000000" w:themeColor="text1"/>
+        </w:rPr>
+        <w:t xml:space="preserve"> </w:t>
+      </w:r>
+      <w:r>
+        <w:rPr>
+          <w:rFonts w:cstheme="minorHAnsi"/>
+          <w:color w:val="000000" w:themeColor="text1"/>
+        </w:rPr>
+        <w:t xml:space="preserve">To run </w:t>
+      </w:r>
+      <w:r>
+        <w:rPr>
+          <w:rFonts w:cstheme="minorHAnsi"/>
+          <w:color w:val="000000" w:themeColor="text1"/>
+        </w:rPr>
+        <w:t xml:space="preserve">the </w:t>
+      </w:r>
+      <w:r>
+        <w:rPr>
+          <w:rFonts w:cstheme="minorHAnsi"/>
+          <w:color w:val="000000" w:themeColor="text1"/>
+        </w:rPr>
+        <w:t xml:space="preserve">Python program, open your </w:t>
+      </w:r>
+      <w:proofErr w:type="spellStart"/>
+      <w:r>
+        <w:rPr>
+          <w:rFonts w:cstheme="minorHAnsi"/>
+          <w:color w:val="000000" w:themeColor="text1"/>
+        </w:rPr>
+        <w:t>NoMachine</w:t>
+      </w:r>
+      <w:proofErr w:type="spellEnd"/>
+      <w:r>
+        <w:rPr>
+          <w:rFonts w:cstheme="minorHAnsi"/>
+          <w:color w:val="000000" w:themeColor="text1"/>
+        </w:rPr>
+        <w:t xml:space="preserve"> desktop</w:t>
+      </w:r>
+      <w:r>
+        <w:rPr>
+          <w:rFonts w:cstheme="minorHAnsi"/>
+          <w:color w:val="000000" w:themeColor="text1"/>
+        </w:rPr>
+        <w:t xml:space="preserve">. Then </w:t>
+      </w:r>
+      <w:r>
+        <w:rPr>
+          <w:rFonts w:cstheme="minorHAnsi"/>
+          <w:color w:val="000000" w:themeColor="text1"/>
+        </w:rPr>
+        <w:t>create</w:t>
+      </w:r>
+      <w:r>
+        <w:rPr>
+          <w:rFonts w:cstheme="minorHAnsi"/>
+          <w:color w:val="000000" w:themeColor="text1"/>
+        </w:rPr>
+        <w:t xml:space="preserve"> a new </w:t>
+      </w:r>
+      <w:r>
+        <w:rPr>
+          <w:rFonts w:cstheme="minorHAnsi"/>
+          <w:color w:val="000000" w:themeColor="text1"/>
+        </w:rPr>
+        <w:t>t</w:t>
+      </w:r>
+      <w:r>
+        <w:rPr>
+          <w:rFonts w:cstheme="minorHAnsi"/>
+          <w:color w:val="000000" w:themeColor="text1"/>
+        </w:rPr>
+        <w:t xml:space="preserve">erminal window and use </w:t>
+      </w:r>
+      <w:proofErr w:type="spellStart"/>
+      <w:r>
+        <w:rPr>
+          <w:rFonts w:cstheme="minorHAnsi"/>
+          <w:i/>
+          <w:color w:val="000000" w:themeColor="text1"/>
+        </w:rPr>
+        <w:t>ssh</w:t>
+      </w:r>
+      <w:proofErr w:type="spellEnd"/>
+      <w:r>
+        <w:rPr>
+          <w:rFonts w:cstheme="minorHAnsi"/>
+          <w:color w:val="000000" w:themeColor="text1"/>
+        </w:rPr>
+        <w:t xml:space="preserve"> to open a connection to a suitable </w:t>
+      </w:r>
+      <w:r>
+        <w:rPr>
+          <w:rFonts w:cstheme="minorHAnsi"/>
+          <w:color w:val="000000" w:themeColor="text1"/>
+        </w:rPr>
+        <w:t>server</w:t>
+      </w:r>
+      <w:r>
+        <w:rPr>
+          <w:rFonts w:cstheme="minorHAnsi"/>
+          <w:color w:val="000000" w:themeColor="text1"/>
+        </w:rPr>
+        <w:t>, for example</w:t>
+      </w:r>
+      <w:r>
+        <w:rPr>
+          <w:rFonts w:cstheme="minorHAnsi"/>
+          <w:color w:val="000000" w:themeColor="text1"/>
+        </w:rPr>
+        <w:t>,</w:t>
+      </w:r>
+      <w:r>
+        <w:rPr>
+          <w:rFonts w:cstheme="minorHAnsi"/>
+          <w:color w:val="000000" w:themeColor="text1"/>
+        </w:rPr>
+        <w:t xml:space="preserve"> </w:t>
+      </w:r>
+      <w:r>
+        <w:rPr>
+          <w:rFonts w:cstheme="minorHAnsi"/>
+          <w:i/>
+          <w:color w:val="000000" w:themeColor="text1"/>
+        </w:rPr>
+        <w:t>liviljobs5</w:t>
+      </w:r>
+      <w:r>
+        <w:rPr>
+          <w:rFonts w:cstheme="minorHAnsi"/>
+          <w:color w:val="000000" w:themeColor="text1"/>
+        </w:rPr>
+        <w:t>:</w:t>
+      </w:r>
+    </w:p>
+    <w:p>
+      <w:pPr>
+        <w:rPr>
+          <w:rFonts w:cstheme="minorHAnsi"/>
+          <w:color w:val="000000" w:themeColor="text1"/>
+        </w:rPr>
+      </w:pPr>
+    </w:p>
+    <w:p>
+      <w:pPr>
+        <w:rPr>
+          <w:rFonts w:cstheme="minorHAnsi"/>
+          <w:b/>
+          <w:color w:val="000000" w:themeColor="text1"/>
+        </w:rPr>
+      </w:pPr>
+      <w:r>
+        <w:rPr>
+          <w:rFonts w:cstheme="minorHAnsi"/>
+          <w:b/>
+          <w:color w:val="000000" w:themeColor="text1"/>
+        </w:rPr>
+        <w:t xml:space="preserve">&gt; </w:t>
+      </w:r>
+      <w:proofErr w:type="spellStart"/>
+      <w:r>
+        <w:rPr>
+          <w:rFonts w:cstheme="minorHAnsi"/>
+          <w:b/>
+          <w:color w:val="000000" w:themeColor="text1"/>
+        </w:rPr>
+        <w:t>ssh</w:t>
+      </w:r>
+      <w:proofErr w:type="spellEnd"/>
+      <w:r>
+        <w:rPr>
+          <w:rFonts w:cstheme="minorHAnsi"/>
+          <w:b/>
+          <w:color w:val="000000" w:themeColor="text1"/>
+        </w:rPr>
+        <w:t xml:space="preserve"> –X argo@livljobs5</w:t>
+      </w:r>
+    </w:p>
+    <w:p>
+      <w:pPr>
+        <w:rPr>
+          <w:rFonts w:cstheme="minorHAnsi"/>
+          <w:color w:val="000000" w:themeColor="text1"/>
+        </w:rPr>
+      </w:pPr>
+    </w:p>
+    <w:p>
+      <w:pPr>
+        <w:pStyle w:val="Heading2"/>
+      </w:pPr>
+      <w:r>
+        <w:t>Environment Setup</w:t>
+      </w:r>
+    </w:p>
+    <w:p>
+      <w:pPr>
+        <w:pStyle w:val="NormalWeb"/>
+      </w:pPr>
+      <w:r>
+        <w:t xml:space="preserve">Instead of manual module loading, this project uses </w:t>
+      </w:r>
+      <w:r>
+        <w:rPr>
+          <w:b/>
+          <w:bCs/>
+        </w:rPr>
+        <w:t>Poetry</w:t>
+      </w:r>
+      <w:r>
+        <w:t xml:space="preserve"> to manage virtual environments and dependencies automatically.</w:t>
+      </w:r>
+    </w:p>
+    <w:p>
+      <w:pPr>
+        <w:pStyle w:val="NormalWeb"/>
+        <w:numPr>
+          <w:ilvl w:val="0"/>
+          <w:numId w:val="43"/>
+        </w:numPr>
+      </w:pPr>
+      <w:r>
+        <w:rPr>
+          <w:b/>
+          <w:bCs/>
+        </w:rPr>
+        <w:t>Verify Poetry Installation:</w:t>
+      </w:r>
+      <w:r>
+        <w:t xml:space="preserve"> Ensure Poetry is installed on the server by running:</w:t>
+      </w:r>
+    </w:p>
+    <w:p>
+      <w:pPr>
+        <w:pStyle w:val="NormalWeb"/>
+        <w:ind w:left="720"/>
+      </w:pPr>
+      <w:r>
+        <w:rPr>
+          <w:rStyle w:val="HTMLCode"/>
+        </w:rPr>
+        <w:t>poetry --version</w:t>
+      </w:r>
+    </w:p>
+    <w:p>
+      <w:pPr>
+        <w:pStyle w:val="NormalWeb"/>
+        <w:ind w:left="720"/>
+      </w:pPr>
+      <w:r>
+        <w:rPr>
+          <w:i/>
+          <w:iCs/>
+        </w:rPr>
+        <w:t xml:space="preserve">If the command is not found, please refer to the </w:t>
+      </w:r>
+      <w:r>
+        <w:rPr>
+          <w:b/>
+          <w:bCs/>
+          <w:i/>
+          <w:iCs/>
+        </w:rPr>
+        <w:t>Prerequisites</w:t>
+      </w:r>
+      <w:r>
+        <w:rPr>
+          <w:i/>
+          <w:iCs/>
+        </w:rPr>
+        <w:t xml:space="preserve"> section of the </w:t>
+      </w:r>
+      <w:r>
+        <w:rPr>
+          <w:rStyle w:val="HTMLCode"/>
+          <w:i/>
+          <w:iCs/>
+        </w:rPr>
+        <w:t>README.md</w:t>
+      </w:r>
+      <w:r>
+        <w:rPr>
+          <w:i/>
+          <w:iCs/>
+        </w:rPr>
+        <w:t xml:space="preserve"> to install Poetry and configure your PATH.</w:t>
+      </w:r>
+    </w:p>
+    <w:p>
+      <w:pPr>
+        <w:pStyle w:val="NormalWeb"/>
+        <w:numPr>
+          <w:ilvl w:val="0"/>
+          <w:numId w:val="43"/>
+        </w:numPr>
+      </w:pPr>
+      <w:r>
+        <w:rPr>
+          <w:b/>
+          <w:bCs/>
+        </w:rPr>
+        <w:t>Initialize the Environment:</w:t>
+      </w:r>
+      <w:r>
+        <w:t xml:space="preserve"> Navigate to the project directory and install the required libraries:</w:t>
+      </w:r>
+    </w:p>
+    <w:p>
+      <w:pPr>
+        <w:pStyle w:val="NormalWeb"/>
+        <w:ind w:left="720"/>
+      </w:pPr>
+      <w:r>
+        <w:rPr>
+          <w:rStyle w:val="HTMLCode"/>
+        </w:rPr>
+        <w:t xml:space="preserve">cd </w:t>
+      </w:r>
+      <w:proofErr w:type="spellStart"/>
+      <w:r>
+        <w:rPr>
+          <w:rStyle w:val="HTMLCode"/>
+        </w:rPr>
+        <w:t>SO_assesment</w:t>
+      </w:r>
+      <w:proofErr w:type="spellEnd"/>
+      <w:r>
+        <w:rPr>
+          <w:rStyle w:val="HTMLCode"/>
+        </w:rPr>
+        <w:t>/DMQC-PCM-Python</w:t>
+      </w:r>
+      <w:r>
+        <w:t xml:space="preserve"> </w:t>
+      </w:r>
+      <w:r>
+        <w:rPr>
+          <w:rStyle w:val="HTMLCode"/>
+        </w:rPr>
+        <w:t>poetry install</w:t>
+      </w:r>
+    </w:p>
+    <w:p>
+      <w:pPr>
+        <w:pStyle w:val="NormalWeb"/>
+        <w:numPr>
+          <w:ilvl w:val="0"/>
+          <w:numId w:val="43"/>
+        </w:numPr>
+      </w:pPr>
+      <w:r>
+        <w:rPr>
+          <w:b/>
+          <w:bCs/>
+        </w:rPr>
+        <w:t>Run the Software:</w:t>
+      </w:r>
+      <w:r>
+        <w:t xml:space="preserve"> Execute the master script within the managed </w:t>
+      </w:r>
+      <w:proofErr w:type="spellStart"/>
+      <w:r>
+        <w:t>environmen</w:t>
+      </w:r>
+      <w:proofErr w:type="spellEnd"/>
+      <w:r>
+        <w:t>:</w:t>
+      </w:r>
+    </w:p>
+    <w:p>
+      <w:pPr>
+        <w:pStyle w:val="NormalWeb"/>
+        <w:ind w:left="1440"/>
+      </w:pPr>
+      <w:r>
+        <w:rPr>
+          <w:b/>
+          <w:bCs/>
+        </w:rPr>
+        <w:t>Use poetry run followed by the WMO number of the float(s) you wish to analyse</w:t>
+      </w:r>
+    </w:p>
+    <w:p>
+      <w:pPr>
+        <w:pStyle w:val="NormalWeb"/>
+        <w:ind w:left="720"/>
+      </w:pPr>
+      <w:r>
+        <w:rPr>
+          <w:rStyle w:val="HTMLCode"/>
+        </w:rPr>
+        <w:t>poetry run python so_dmqc_master.py</w:t>
+      </w:r>
+      <w:r>
+        <w:rPr>
+          <w:rStyle w:val="HTMLCode"/>
+        </w:rPr>
+        <w:t xml:space="preserve"> &lt;wmo&gt;</w:t>
+      </w:r>
+    </w:p>
+    <w:p>
+      <w:pPr>
+        <w:rPr>
+          <w:rFonts w:cstheme="minorHAnsi"/>
+          <w:color w:val="000000" w:themeColor="text1"/>
+        </w:rPr>
+      </w:pPr>
+      <w:bookmarkStart w:id="5" w:name="_GoBack"/>
       <w:bookmarkEnd w:id="5"/>
-    </w:p>
-    <w:p>
-      <w:pPr>
-        <w:rPr>
-          <w:rFonts w:cstheme="minorHAnsi"/>
-          <w:color w:val="000000" w:themeColor="text1"/>
-        </w:rPr>
-      </w:pPr>
-    </w:p>
-    <w:p>
-      <w:pPr>
-        <w:jc w:val="both"/>
-        <w:rPr>
-          <w:rFonts w:cstheme="minorHAnsi"/>
-          <w:color w:val="000000" w:themeColor="text1"/>
-        </w:rPr>
-      </w:pPr>
-      <w:r>
-        <w:rPr>
-          <w:rFonts w:cstheme="minorHAnsi"/>
-          <w:color w:val="000000" w:themeColor="text1"/>
-        </w:rPr>
-        <w:t xml:space="preserve">The </w:t>
-      </w:r>
-      <w:r>
-        <w:rPr>
-          <w:rFonts w:cstheme="minorHAnsi"/>
-          <w:color w:val="000000" w:themeColor="text1"/>
-        </w:rPr>
-        <w:t>SO quality assessment method operates</w:t>
-      </w:r>
-      <w:r>
-        <w:rPr>
-          <w:rFonts w:cstheme="minorHAnsi"/>
-          <w:color w:val="000000" w:themeColor="text1"/>
-        </w:rPr>
-        <w:t xml:space="preserve"> using python</w:t>
-      </w:r>
-      <w:r>
-        <w:rPr>
-          <w:rFonts w:cstheme="minorHAnsi"/>
-          <w:color w:val="000000" w:themeColor="text1"/>
-        </w:rPr>
-        <w:t>.</w:t>
-      </w:r>
-      <w:r>
-        <w:rPr>
-          <w:rFonts w:cstheme="minorHAnsi"/>
-          <w:color w:val="000000" w:themeColor="text1"/>
-        </w:rPr>
-        <w:t xml:space="preserve"> </w:t>
-      </w:r>
-      <w:r>
-        <w:rPr>
-          <w:rFonts w:cstheme="minorHAnsi"/>
-          <w:color w:val="000000" w:themeColor="text1"/>
-        </w:rPr>
-        <w:t xml:space="preserve">To run </w:t>
-      </w:r>
-      <w:r>
-        <w:rPr>
-          <w:rFonts w:cstheme="minorHAnsi"/>
-          <w:color w:val="000000" w:themeColor="text1"/>
-        </w:rPr>
-        <w:t xml:space="preserve">the </w:t>
-      </w:r>
-      <w:r>
-        <w:rPr>
-          <w:rFonts w:cstheme="minorHAnsi"/>
-          <w:color w:val="000000" w:themeColor="text1"/>
-        </w:rPr>
-        <w:t xml:space="preserve">Python program, open your </w:t>
-      </w:r>
-      <w:proofErr w:type="spellStart"/>
-      <w:r>
-        <w:rPr>
-          <w:rFonts w:cstheme="minorHAnsi"/>
-          <w:color w:val="000000" w:themeColor="text1"/>
-        </w:rPr>
-        <w:t>NoMachine</w:t>
-      </w:r>
-      <w:proofErr w:type="spellEnd"/>
-      <w:r>
-        <w:rPr>
-          <w:rFonts w:cstheme="minorHAnsi"/>
-          <w:color w:val="000000" w:themeColor="text1"/>
-        </w:rPr>
-        <w:t xml:space="preserve"> desktop</w:t>
-      </w:r>
-      <w:r>
-        <w:rPr>
-          <w:rFonts w:cstheme="minorHAnsi"/>
-          <w:color w:val="000000" w:themeColor="text1"/>
-        </w:rPr>
-        <w:t xml:space="preserve">. Then </w:t>
-      </w:r>
-      <w:r>
-        <w:rPr>
-          <w:rFonts w:cstheme="minorHAnsi"/>
-          <w:color w:val="000000" w:themeColor="text1"/>
-        </w:rPr>
-        <w:t>create</w:t>
-      </w:r>
-      <w:r>
-        <w:rPr>
-          <w:rFonts w:cstheme="minorHAnsi"/>
-          <w:color w:val="000000" w:themeColor="text1"/>
-        </w:rPr>
-        <w:t xml:space="preserve"> a new </w:t>
-      </w:r>
-      <w:r>
-        <w:rPr>
-          <w:rFonts w:cstheme="minorHAnsi"/>
-          <w:color w:val="000000" w:themeColor="text1"/>
-        </w:rPr>
-        <w:t>t</w:t>
-      </w:r>
-      <w:r>
-        <w:rPr>
-          <w:rFonts w:cstheme="minorHAnsi"/>
-          <w:color w:val="000000" w:themeColor="text1"/>
-        </w:rPr>
-        <w:t xml:space="preserve">erminal window and use </w:t>
-      </w:r>
-      <w:proofErr w:type="spellStart"/>
-      <w:r>
-        <w:rPr>
-          <w:rFonts w:cstheme="minorHAnsi"/>
-          <w:i/>
-          <w:color w:val="000000" w:themeColor="text1"/>
-        </w:rPr>
-        <w:t>ssh</w:t>
-      </w:r>
-      <w:proofErr w:type="spellEnd"/>
-      <w:r>
-        <w:rPr>
-          <w:rFonts w:cstheme="minorHAnsi"/>
-          <w:color w:val="000000" w:themeColor="text1"/>
-        </w:rPr>
-        <w:t xml:space="preserve"> to open a connection to a suitable </w:t>
-      </w:r>
-      <w:r>
-        <w:rPr>
-          <w:rFonts w:cstheme="minorHAnsi"/>
-          <w:color w:val="000000" w:themeColor="text1"/>
-        </w:rPr>
-        <w:t>server</w:t>
-      </w:r>
-      <w:r>
-        <w:rPr>
-          <w:rFonts w:cstheme="minorHAnsi"/>
-          <w:color w:val="000000" w:themeColor="text1"/>
-        </w:rPr>
-        <w:t>, for example</w:t>
-      </w:r>
-      <w:r>
-        <w:rPr>
-          <w:rFonts w:cstheme="minorHAnsi"/>
-          <w:color w:val="000000" w:themeColor="text1"/>
-        </w:rPr>
-        <w:t>,</w:t>
-      </w:r>
-      <w:r>
-        <w:rPr>
-          <w:rFonts w:cstheme="minorHAnsi"/>
-          <w:color w:val="000000" w:themeColor="text1"/>
-        </w:rPr>
-        <w:t xml:space="preserve"> </w:t>
-      </w:r>
-      <w:r>
-        <w:rPr>
-          <w:rFonts w:cstheme="minorHAnsi"/>
-          <w:i/>
-          <w:color w:val="000000" w:themeColor="text1"/>
-        </w:rPr>
-        <w:t>liviljobs5</w:t>
-      </w:r>
-      <w:r>
-        <w:rPr>
-          <w:rFonts w:cstheme="minorHAnsi"/>
-          <w:color w:val="000000" w:themeColor="text1"/>
-        </w:rPr>
-        <w:t>:</w:t>
-      </w:r>
-    </w:p>
-    <w:p>
-      <w:pPr>
-        <w:rPr>
-          <w:rFonts w:cstheme="minorHAnsi"/>
-          <w:color w:val="000000" w:themeColor="text1"/>
-        </w:rPr>
-      </w:pPr>
-    </w:p>
-    <w:p>
-      <w:pPr>
-        <w:rPr>
-          <w:rFonts w:cstheme="minorHAnsi"/>
-          <w:b/>
-          <w:color w:val="000000" w:themeColor="text1"/>
-        </w:rPr>
-      </w:pPr>
-      <w:r>
-        <w:rPr>
-          <w:rFonts w:cstheme="minorHAnsi"/>
-          <w:b/>
-          <w:color w:val="000000" w:themeColor="text1"/>
-        </w:rPr>
-        <w:t xml:space="preserve">&gt; </w:t>
-      </w:r>
-      <w:proofErr w:type="spellStart"/>
-      <w:r>
-        <w:rPr>
-          <w:rFonts w:cstheme="minorHAnsi"/>
-          <w:b/>
-          <w:color w:val="000000" w:themeColor="text1"/>
-        </w:rPr>
-        <w:t>ssh</w:t>
-      </w:r>
-      <w:proofErr w:type="spellEnd"/>
-      <w:r>
-        <w:rPr>
-          <w:rFonts w:cstheme="minorHAnsi"/>
-          <w:b/>
-          <w:color w:val="000000" w:themeColor="text1"/>
-        </w:rPr>
-        <w:t xml:space="preserve"> –X argo@livljobs5</w:t>
-      </w:r>
-    </w:p>
-    <w:p>
-      <w:pPr>
-        <w:rPr>
-          <w:rFonts w:cstheme="minorHAnsi"/>
-          <w:color w:val="000000" w:themeColor="text1"/>
-        </w:rPr>
-      </w:pPr>
-    </w:p>
-    <w:p>
-      <w:pPr>
-        <w:rPr>
-          <w:rFonts w:cstheme="minorHAnsi"/>
-          <w:color w:val="000000" w:themeColor="text1"/>
-        </w:rPr>
-      </w:pPr>
-      <w:r>
-        <w:rPr>
-          <w:rFonts w:cstheme="minorHAnsi"/>
-          <w:color w:val="000000" w:themeColor="text1"/>
-        </w:rPr>
-        <w:t>Load the python environment required for running the PCM code:</w:t>
-      </w:r>
-    </w:p>
-    <w:p>
-      <w:pPr>
-        <w:rPr>
-          <w:rFonts w:cstheme="minorHAnsi"/>
-          <w:color w:val="000000" w:themeColor="text1"/>
-        </w:rPr>
-      </w:pPr>
-    </w:p>
-    <w:p>
-      <w:pPr>
-        <w:rPr>
-          <w:rFonts w:cstheme="minorHAnsi"/>
-          <w:b/>
-          <w:color w:val="000000" w:themeColor="text1"/>
-        </w:rPr>
-      </w:pPr>
-      <w:r>
-        <w:rPr>
-          <w:rFonts w:cstheme="minorHAnsi"/>
-          <w:b/>
-          <w:color w:val="000000" w:themeColor="text1"/>
-        </w:rPr>
-        <w:t>&gt; module add anaconda</w:t>
-      </w:r>
-    </w:p>
-    <w:p>
-      <w:pPr>
-        <w:rPr>
-          <w:rFonts w:cstheme="minorHAnsi"/>
-          <w:color w:val="000000" w:themeColor="text1"/>
-        </w:rPr>
-      </w:pPr>
-    </w:p>
-    <w:p>
-      <w:pPr>
-        <w:rPr>
-          <w:rFonts w:cstheme="minorHAnsi"/>
-          <w:b/>
-          <w:color w:val="000000" w:themeColor="text1"/>
-        </w:rPr>
-      </w:pPr>
-      <w:r>
-        <w:rPr>
-          <w:rFonts w:cstheme="minorHAnsi"/>
-          <w:b/>
-          <w:color w:val="000000" w:themeColor="text1"/>
-        </w:rPr>
-        <w:lastRenderedPageBreak/>
-        <w:t xml:space="preserve">&gt; source activate </w:t>
-      </w:r>
-      <w:proofErr w:type="spellStart"/>
-      <w:r>
-        <w:rPr>
-          <w:rFonts w:cstheme="minorHAnsi"/>
-          <w:b/>
-          <w:color w:val="000000" w:themeColor="text1"/>
-        </w:rPr>
-        <w:t>so_dmqc</w:t>
-      </w:r>
-      <w:proofErr w:type="spellEnd"/>
-    </w:p>
-    <w:p>
-      <w:pPr>
-        <w:rPr>
-          <w:rFonts w:cstheme="minorHAnsi"/>
-          <w:color w:val="000000" w:themeColor="text1"/>
-        </w:rPr>
-      </w:pPr>
-    </w:p>
-    <w:p>
-      <w:pPr>
-        <w:rPr>
-          <w:rFonts w:cstheme="minorHAnsi"/>
-          <w:color w:val="000000" w:themeColor="text1"/>
-        </w:rPr>
-      </w:pPr>
-      <w:r>
-        <w:rPr>
-          <w:rFonts w:cstheme="minorHAnsi"/>
-          <w:color w:val="000000" w:themeColor="text1"/>
-        </w:rPr>
-        <w:t xml:space="preserve">This will make the required </w:t>
-      </w:r>
-      <w:r>
-        <w:rPr>
-          <w:rFonts w:cstheme="minorHAnsi"/>
-          <w:color w:val="000000" w:themeColor="text1"/>
-        </w:rPr>
-        <w:t>P</w:t>
-      </w:r>
-      <w:r>
-        <w:rPr>
-          <w:rFonts w:cstheme="minorHAnsi"/>
-          <w:color w:val="000000" w:themeColor="text1"/>
-        </w:rPr>
-        <w:t>ython libraries available for running the code.</w:t>
-      </w:r>
-      <w:r>
-        <w:rPr>
-          <w:rFonts w:cstheme="minorHAnsi"/>
-          <w:color w:val="000000" w:themeColor="text1"/>
-        </w:rPr>
-        <w:t xml:space="preserve"> </w:t>
-      </w:r>
-    </w:p>
-    <w:p>
-      <w:pPr>
-        <w:rPr>
-          <w:rFonts w:cstheme="minorHAnsi"/>
-          <w:color w:val="000000" w:themeColor="text1"/>
-        </w:rPr>
-      </w:pPr>
     </w:p>
     <w:p>
       <w:pPr>
@@ -3581,7 +3630,23 @@
           <w:b/>
           <w:color w:val="000000" w:themeColor="text1"/>
         </w:rPr>
-        <w:t>&gt; python master_argo_index_reader.py</w:t>
+        <w:t xml:space="preserve">&gt; </w:t>
+      </w:r>
+      <w:r>
+        <w:rPr>
+          <w:rFonts w:cstheme="minorHAnsi"/>
+          <w:b/>
+          <w:color w:val="000000" w:themeColor="text1"/>
+        </w:rPr>
+        <w:t xml:space="preserve">poetry run </w:t>
+      </w:r>
+      <w:r>
+        <w:rPr>
+          <w:rFonts w:cstheme="minorHAnsi"/>
+          <w:b/>
+          <w:color w:val="000000" w:themeColor="text1"/>
+        </w:rPr>
+        <w:t>python master_argo_index_reader.py</w:t>
       </w:r>
     </w:p>
     <w:p>
@@ -4626,35 +4691,7 @@
           <w:rFonts w:ascii="Calibri" w:hAnsi="Calibri" w:cs="Calibri"/>
           <w:color w:val="000000"/>
         </w:rPr>
-        <w:t>To best represent the dynamic condition in this region and for further comparison of output with the DM data the constant values of the objective mapping parameters have been used (Table 1).</w:t>
-      </w:r>
-      <w:r>
-        <w:rPr>
-          <w:rFonts w:ascii="Calibri" w:hAnsi="Calibri" w:cs="Calibri"/>
-          <w:color w:val="000000"/>
-        </w:rPr>
-        <w:t xml:space="preserve"> </w:t>
-      </w:r>
-      <w:r>
-        <w:rPr>
-          <w:rFonts w:ascii="Calibri" w:hAnsi="Calibri" w:cs="Calibri"/>
-          <w:color w:val="000000"/>
-        </w:rPr>
-        <w:t> </w:t>
-      </w:r>
-      <w:r>
-        <w:rPr>
-          <w:rFonts w:ascii="Calibri" w:hAnsi="Calibri" w:cs="Calibri"/>
-          <w:color w:val="000000"/>
-        </w:rPr>
-        <w:t>T</w:t>
-      </w:r>
-      <w:r>
-        <w:rPr>
-          <w:rFonts w:ascii="Calibri" w:hAnsi="Calibri" w:cs="Calibri"/>
-          <w:color w:val="000000"/>
-        </w:rPr>
-        <w:t xml:space="preserve">he floats which are going through the SO quality assessment analysis are firstly run using the first “SO1” configurations. The other sets of configurations are used if the specific float </w:t>
+        <w:t xml:space="preserve">To best represent the dynamic condition in this region and for further comparison of output with the DM data the constant values of the objective mapping parameters have been used (Table 1).  The floats which are going through the SO quality assessment analysis are firstly run using the first “SO1” configurations. The other sets of configurations are used if the specific float </w:t>
       </w:r>
       <w:proofErr w:type="gramStart"/>
       <w:r>
@@ -5290,7 +5327,6 @@
                 <w:color w:val="000000"/>
                 <w:lang w:eastAsia="en-GB"/>
               </w:rPr>
-              <w:lastRenderedPageBreak/>
               <w:t>Reference database</w:t>
             </w:r>
           </w:p>
@@ -5328,7 +5364,6 @@
                 <w:color w:val="000000"/>
                 <w:lang w:eastAsia="en-GB"/>
               </w:rPr>
-              <w:lastRenderedPageBreak/>
               <w:t>310</w:t>
             </w:r>
           </w:p>
@@ -5595,7 +5630,6 @@
                 <w:color w:val="000000"/>
                 <w:lang w:eastAsia="en-GB"/>
               </w:rPr>
-              <w:lastRenderedPageBreak/>
               <w:t>CTD +Argo</w:t>
             </w:r>
           </w:p>
@@ -5633,7 +5667,6 @@
                 <w:color w:val="000000"/>
                 <w:lang w:eastAsia="en-GB"/>
               </w:rPr>
-              <w:lastRenderedPageBreak/>
               <w:t>310</w:t>
             </w:r>
           </w:p>
@@ -5900,7 +5933,6 @@
                 <w:color w:val="000000"/>
                 <w:lang w:eastAsia="en-GB"/>
               </w:rPr>
-              <w:lastRenderedPageBreak/>
               <w:t>CTD +Argo</w:t>
             </w:r>
           </w:p>
@@ -5938,7 +5970,6 @@
                 <w:color w:val="000000"/>
                 <w:lang w:eastAsia="en-GB"/>
               </w:rPr>
-              <w:lastRenderedPageBreak/>
               <w:t>310</w:t>
             </w:r>
           </w:p>
@@ -6205,7 +6236,6 @@
                 <w:color w:val="000000"/>
                 <w:lang w:eastAsia="en-GB"/>
               </w:rPr>
-              <w:lastRenderedPageBreak/>
               <w:t>CTD +Argo</w:t>
             </w:r>
           </w:p>
@@ -6251,7 +6281,6 @@
                 <w:color w:val="000000"/>
                 <w:lang w:eastAsia="en-GB"/>
               </w:rPr>
-              <w:lastRenderedPageBreak/>
               <w:t>Set_calseries</w:t>
             </w:r>
             <w:proofErr w:type="spellEnd"/>
@@ -6742,7 +6771,6 @@
         <w:t xml:space="preserve">This Python code (1) retrieves data from the local repository or GDAC (using </w:t>
       </w:r>
       <w:hyperlink r:id="rId13" w:history="1">
-        <w:proofErr w:type="spellStart"/>
         <w:r>
           <w:rPr>
             <w:rStyle w:val="Hyperlink"/>
@@ -6751,7 +6779,6 @@
           </w:rPr>
           <w:t>argopy</w:t>
         </w:r>
-        <w:proofErr w:type="spellEnd"/>
       </w:hyperlink>
       <w:r>
         <w:rPr>
@@ -6761,7 +6788,6 @@
         <w:t xml:space="preserve"> package), (2) automatically generates the source code for OWC analysis (using </w:t>
       </w:r>
       <w:hyperlink r:id="rId14" w:history="1">
-        <w:proofErr w:type="spellStart"/>
         <w:r>
           <w:rPr>
             <w:rStyle w:val="Hyperlink"/>
@@ -6770,7 +6796,6 @@
           </w:rPr>
           <w:t>argopy</w:t>
         </w:r>
-        <w:proofErr w:type="spellEnd"/>
       </w:hyperlink>
       <w:r>
         <w:rPr>
@@ -6839,15 +6864,7 @@
           <w:color w:val="000000" w:themeColor="text1"/>
           <w:sz w:val="22"/>
         </w:rPr>
-        <w:t>This code is located in the</w:t>
-      </w:r>
-      <w:r>
-        <w:rPr>
-          <w:rFonts w:asciiTheme="minorHAnsi" w:hAnsiTheme="minorHAnsi" w:cstheme="minorHAnsi"/>
-          <w:color w:val="000000" w:themeColor="text1"/>
-          <w:sz w:val="22"/>
-        </w:rPr>
-        <w:t xml:space="preserve"> </w:t>
+        <w:t xml:space="preserve">This code is located in the </w:t>
       </w:r>
       <w:r>
         <w:rPr>
@@ -7148,80 +7165,12 @@
           <w:color w:val="000000"/>
           <w:shd w:val="clear" w:color="auto" w:fill="FFFFFF"/>
         </w:rPr>
-        <w:t xml:space="preserve"> file) and the adjusted Argo float data in DM. The output plot visualising the </w:t>
-      </w:r>
-      <w:proofErr w:type="gramStart"/>
+        <w:t xml:space="preserve"> file) and the adjusted Argo float data in DM. The output plot visualising the difference  is presented in figure 4.1. Floats with a salinity  correction difference of +/- 0.01 are selected for more detailed checks. This includes multiple OWC iterations including different settings e.g. split time series, select pressure or theta levels. </w:t>
+      </w:r>
       <w:r>
         <w:rPr>
           <w:rFonts w:ascii="Calibri" w:hAnsi="Calibri" w:cs="Calibri"/>
           <w:color w:val="000000"/>
-          <w:shd w:val="clear" w:color="auto" w:fill="FFFFFF"/>
-        </w:rPr>
-        <w:t>difference  is</w:t>
-      </w:r>
-      <w:proofErr w:type="gramEnd"/>
-      <w:r>
-        <w:rPr>
-          <w:rFonts w:ascii="Calibri" w:hAnsi="Calibri" w:cs="Calibri"/>
-          <w:color w:val="000000"/>
-          <w:shd w:val="clear" w:color="auto" w:fill="FFFFFF"/>
-        </w:rPr>
-        <w:t xml:space="preserve"> presented in figure </w:t>
-      </w:r>
-      <w:r>
-        <w:rPr>
-          <w:rFonts w:ascii="Calibri" w:hAnsi="Calibri" w:cs="Calibri"/>
-          <w:color w:val="000000"/>
-          <w:shd w:val="clear" w:color="auto" w:fill="FFFFFF"/>
-        </w:rPr>
-        <w:t>4</w:t>
-      </w:r>
-      <w:r>
-        <w:rPr>
-          <w:rFonts w:ascii="Calibri" w:hAnsi="Calibri" w:cs="Calibri"/>
-          <w:color w:val="000000"/>
-          <w:shd w:val="clear" w:color="auto" w:fill="FFFFFF"/>
-        </w:rPr>
-        <w:t>.</w:t>
-      </w:r>
-      <w:r>
-        <w:rPr>
-          <w:rFonts w:ascii="Calibri" w:hAnsi="Calibri" w:cs="Calibri"/>
-          <w:color w:val="000000"/>
-          <w:shd w:val="clear" w:color="auto" w:fill="FFFFFF"/>
-        </w:rPr>
-        <w:t>1</w:t>
-      </w:r>
-      <w:r>
-        <w:rPr>
-          <w:rFonts w:ascii="Calibri" w:hAnsi="Calibri" w:cs="Calibri"/>
-          <w:color w:val="000000"/>
-          <w:shd w:val="clear" w:color="auto" w:fill="FFFFFF"/>
-        </w:rPr>
-        <w:t xml:space="preserve">. Floats with a </w:t>
-      </w:r>
-      <w:proofErr w:type="gramStart"/>
-      <w:r>
-        <w:rPr>
-          <w:rFonts w:ascii="Calibri" w:hAnsi="Calibri" w:cs="Calibri"/>
-          <w:color w:val="000000"/>
-          <w:shd w:val="clear" w:color="auto" w:fill="FFFFFF"/>
-        </w:rPr>
-        <w:t>salinity  correction</w:t>
-      </w:r>
-      <w:proofErr w:type="gramEnd"/>
-      <w:r>
-        <w:rPr>
-          <w:rFonts w:ascii="Calibri" w:hAnsi="Calibri" w:cs="Calibri"/>
-          <w:color w:val="000000"/>
-          <w:shd w:val="clear" w:color="auto" w:fill="FFFFFF"/>
-        </w:rPr>
-        <w:t xml:space="preserve"> difference of +/- 0.01 are selected for more detailed checks. This includes multiple OWC iterations including different settings e.g. split time series, select pressure or theta levels. </w:t>
-      </w:r>
-      <w:r>
-        <w:rPr>
-          <w:rFonts w:ascii="Calibri" w:hAnsi="Calibri" w:cs="Calibri"/>
-          <w:color w:val="000000"/>
         </w:rPr>
         <w:t>Any indication of the significant discrepancy between the analysed data is described in the generated report and feedback with suggested modifications to salinity data is sent to the operator responsible for this float.</w:t>
       </w:r>
@@ -7258,7 +7207,6 @@
         </w:rPr>
         <w:t xml:space="preserve"> </w:t>
       </w:r>
-      <w:proofErr w:type="spellStart"/>
       <w:r>
         <w:rPr>
           <w:rFonts w:cstheme="minorHAnsi"/>
@@ -7267,7 +7215,6 @@
         </w:rPr>
         <w:t>ctd</w:t>
       </w:r>
-      <w:proofErr w:type="spellEnd"/>
       <w:r>
         <w:rPr>
           <w:rFonts w:cstheme="minorHAnsi"/>
@@ -7306,7 +7253,6 @@
         <w:rPr>
           <w:noProof/>
         </w:rPr>
-        <w:lastRenderedPageBreak/>
         <w:drawing>
           <wp:inline distT="0" distB="0" distL="0" distR="0" wp14:anchorId="1E34DB91" wp14:editId="5515BAF9">
             <wp:extent cx="3209925" cy="4011006"/>
@@ -7614,27 +7560,7 @@
           <w:szCs w:val="22"/>
           <w:shd w:val="clear" w:color="auto" w:fill="FFFFFF"/>
         </w:rPr>
-        <w:t>All necessary directories, constants values for PCM, and objective mapping parameters which are needed to run both PCM and OWC software can be set in one initial file</w:t>
-      </w:r>
-      <w:r>
-        <w:rPr>
-          <w:rFonts w:ascii="Calibri" w:hAnsi="Calibri" w:cs="Calibri"/>
-          <w:color w:val="000000"/>
-          <w:sz w:val="22"/>
-          <w:szCs w:val="22"/>
-          <w:shd w:val="clear" w:color="auto" w:fill="FFFFFF"/>
-        </w:rPr>
-        <w:t xml:space="preserve"> below. </w:t>
-      </w:r>
-      <w:r>
-        <w:rPr>
-          <w:rFonts w:ascii="Calibri" w:hAnsi="Calibri" w:cs="Calibri"/>
-          <w:color w:val="000000"/>
-          <w:sz w:val="22"/>
-          <w:szCs w:val="22"/>
-          <w:shd w:val="clear" w:color="auto" w:fill="FFFFFF"/>
-        </w:rPr>
-        <w:t> The configurations used are the same as in the DMQC-PCM-main software.  </w:t>
+        <w:t>All necessary directories, constants values for PCM, and objective mapping parameters which are needed to run both PCM and OWC software can be set in one initial file below.  The configurations used are the same as in the DMQC-PCM-main software.  </w:t>
       </w:r>
     </w:p>
     <w:p>
@@ -7813,7 +7739,6 @@
           <w:shd w:val="clear" w:color="auto" w:fill="FFFFFF"/>
           <w:lang w:eastAsia="en-GB"/>
         </w:rPr>
-        <w:lastRenderedPageBreak/>
         <w:t>master_dac_comp.py</w:t>
       </w:r>
     </w:p>
@@ -7876,13 +7801,8 @@
       <w:r>
         <w:t xml:space="preserve">Changes to the </w:t>
       </w:r>
-      <w:proofErr w:type="spellStart"/>
-      <w:r>
-        <w:t>argopy</w:t>
-      </w:r>
-      <w:proofErr w:type="spellEnd"/>
-      <w:r>
-        <w:t xml:space="preserve"> configuration</w:t>
+      <w:r>
+        <w:t>argopy configuration</w:t>
       </w:r>
       <w:bookmarkEnd w:id="14"/>
       <w:bookmarkEnd w:id="15"/>
@@ -7921,7 +7841,7 @@
           <w:rFonts w:cstheme="minorHAnsi"/>
           <w:color w:val="000000" w:themeColor="text1"/>
         </w:rPr>
-        <w:t xml:space="preserve"> the </w:t>
+        <w:t xml:space="preserve"> the argopy python library that is part of the </w:t>
       </w:r>
       <w:proofErr w:type="spellStart"/>
       <w:r>
@@ -7929,7 +7849,7 @@
           <w:rFonts w:cstheme="minorHAnsi"/>
           <w:color w:val="000000" w:themeColor="text1"/>
         </w:rPr>
-        <w:t>argopy</w:t>
+        <w:t>so_dmqc</w:t>
       </w:r>
       <w:proofErr w:type="spellEnd"/>
       <w:r>
@@ -7937,7 +7857,56 @@
           <w:rFonts w:cstheme="minorHAnsi"/>
           <w:color w:val="000000" w:themeColor="text1"/>
         </w:rPr>
-        <w:t xml:space="preserve"> python library that is part of the </w:t>
+        <w:t xml:space="preserve"> environment is 0.1.11. If this library version updates in the future, the following python file needs editing:</w:t>
+      </w:r>
+    </w:p>
+    <w:p>
+      <w:pPr>
+        <w:rPr>
+          <w:rFonts w:cstheme="minorHAnsi"/>
+          <w:color w:val="000000" w:themeColor="text1"/>
+        </w:rPr>
+      </w:pPr>
+    </w:p>
+    <w:p>
+      <w:pPr>
+        <w:ind w:firstLine="720"/>
+        <w:rPr>
+          <w:rFonts w:cstheme="minorHAnsi"/>
+          <w:b/>
+          <w:color w:val="000000" w:themeColor="text1"/>
+        </w:rPr>
+      </w:pPr>
+      <w:r>
+        <w:rPr>
+          <w:rFonts w:cstheme="minorHAnsi"/>
+          <w:b/>
+          <w:color w:val="000000" w:themeColor="text1"/>
+        </w:rPr>
+        <w:t>\users\argo\.conda\envs\so_dmqc\lib\python3.9\site-packages\argopy\xarray.py</w:t>
+      </w:r>
+    </w:p>
+    <w:p>
+      <w:pPr>
+        <w:rPr>
+          <w:rFonts w:cstheme="minorHAnsi"/>
+          <w:color w:val="000000" w:themeColor="text1"/>
+        </w:rPr>
+      </w:pPr>
+    </w:p>
+    <w:p>
+      <w:pPr>
+        <w:rPr>
+          <w:rFonts w:cstheme="minorHAnsi"/>
+          <w:color w:val="000000" w:themeColor="text1"/>
+        </w:rPr>
+      </w:pPr>
+      <w:r>
+        <w:rPr>
+          <w:rFonts w:cstheme="minorHAnsi"/>
+          <w:color w:val="000000" w:themeColor="text1"/>
+        </w:rPr>
+        <w:t xml:space="preserve">The data types for the variables saved into the Wong matrix in the </w:t>
       </w:r>
       <w:proofErr w:type="spellStart"/>
       <w:r>
@@ -7945,7 +7914,7 @@
           <w:rFonts w:cstheme="minorHAnsi"/>
           <w:color w:val="000000" w:themeColor="text1"/>
         </w:rPr>
-        <w:t>so_dmqc</w:t>
+        <w:t>create_float_source</w:t>
       </w:r>
       <w:proofErr w:type="spellEnd"/>
       <w:r>
@@ -7953,85 +7922,18 @@
           <w:rFonts w:cstheme="minorHAnsi"/>
           <w:color w:val="000000" w:themeColor="text1"/>
         </w:rPr>
-        <w:t xml:space="preserve"> environment is 0.1.11. If this library version updates in the future, the following python file needs editing:</w:t>
-      </w:r>
-    </w:p>
-    <w:p>
-      <w:pPr>
-        <w:rPr>
-          <w:rFonts w:cstheme="minorHAnsi"/>
-          <w:color w:val="000000" w:themeColor="text1"/>
-        </w:rPr>
-      </w:pPr>
-    </w:p>
-    <w:p>
-      <w:pPr>
-        <w:ind w:firstLine="720"/>
+        <w:t xml:space="preserve"> method have to be set to be of datatype “</w:t>
+      </w:r>
+      <w:proofErr w:type="spellStart"/>
+      <w:r>
         <w:rPr>
           <w:rFonts w:cstheme="minorHAnsi"/>
           <w:b/>
           <w:color w:val="000000" w:themeColor="text1"/>
         </w:rPr>
-      </w:pPr>
-      <w:r>
-        <w:rPr>
-          <w:rFonts w:cstheme="minorHAnsi"/>
-          <w:b/>
-          <w:color w:val="000000" w:themeColor="text1"/>
-        </w:rPr>
-        <w:t>\users\argo\.conda\envs\so_dmqc\lib\python3.9\site-packages\argopy\xarray.py</w:t>
-      </w:r>
-    </w:p>
-    <w:p>
-      <w:pPr>
-        <w:rPr>
-          <w:rFonts w:cstheme="minorHAnsi"/>
-          <w:color w:val="000000" w:themeColor="text1"/>
-        </w:rPr>
-      </w:pPr>
-    </w:p>
-    <w:p>
-      <w:pPr>
-        <w:rPr>
-          <w:rFonts w:cstheme="minorHAnsi"/>
-          <w:color w:val="000000" w:themeColor="text1"/>
-        </w:rPr>
-      </w:pPr>
-      <w:r>
-        <w:rPr>
-          <w:rFonts w:cstheme="minorHAnsi"/>
-          <w:color w:val="000000" w:themeColor="text1"/>
-        </w:rPr>
-        <w:t xml:space="preserve">The data types for the variables saved into the Wong matrix in the </w:t>
-      </w:r>
-      <w:proofErr w:type="spellStart"/>
-      <w:r>
-        <w:rPr>
-          <w:rFonts w:cstheme="minorHAnsi"/>
-          <w:color w:val="000000" w:themeColor="text1"/>
-        </w:rPr>
-        <w:t>create_float_source</w:t>
+        <w:t>np.double</w:t>
       </w:r>
       <w:proofErr w:type="spellEnd"/>
-      <w:r>
-        <w:rPr>
-          <w:rFonts w:cstheme="minorHAnsi"/>
-          <w:color w:val="000000" w:themeColor="text1"/>
-        </w:rPr>
-        <w:t xml:space="preserve"> method have to be set to be of datatype “</w:t>
-      </w:r>
-      <w:proofErr w:type="spellStart"/>
-      <w:proofErr w:type="gramStart"/>
-      <w:r>
-        <w:rPr>
-          <w:rFonts w:cstheme="minorHAnsi"/>
-          <w:b/>
-          <w:color w:val="000000" w:themeColor="text1"/>
-        </w:rPr>
-        <w:t>np.double</w:t>
-      </w:r>
-      <w:proofErr w:type="spellEnd"/>
-      <w:proofErr w:type="gramEnd"/>
       <w:r>
         <w:rPr>
           <w:rFonts w:cstheme="minorHAnsi"/>
@@ -8396,7 +8298,6 @@
           <w:color w:val="000000" w:themeColor="text1"/>
           <w:lang w:eastAsia="en-GB"/>
         </w:rPr>
-        <w:lastRenderedPageBreak/>
         <w:drawing>
           <wp:inline distT="0" distB="0" distL="0" distR="0" wp14:anchorId="23A4CF4F" wp14:editId="04B1DD06">
             <wp:extent cx="4219575" cy="523875"/>
@@ -8470,7 +8371,21 @@
           <w:rFonts w:cstheme="minorHAnsi"/>
           <w:color w:val="000000" w:themeColor="text1"/>
         </w:rPr>
-        <w:t xml:space="preserve">” method from the Data Fetcher is going to be depreciated in the next release of </w:t>
+        <w:t>” method from the Data Fetcher is going to be depreciated in the next release of argopy so the call</w:t>
+      </w:r>
+      <w:r>
+        <w:rPr>
+          <w:rFonts w:cstheme="minorHAnsi"/>
+          <w:color w:val="000000" w:themeColor="text1"/>
+        </w:rPr>
+        <w:t>-</w:t>
+      </w:r>
+      <w:r>
+        <w:rPr>
+          <w:rFonts w:cstheme="minorHAnsi"/>
+          <w:color w:val="000000" w:themeColor="text1"/>
+        </w:rPr>
+        <w:t>in line 72 of the “</w:t>
       </w:r>
       <w:proofErr w:type="spellStart"/>
       <w:r>
@@ -8478,7 +8393,7 @@
           <w:rFonts w:cstheme="minorHAnsi"/>
           <w:color w:val="000000" w:themeColor="text1"/>
         </w:rPr>
-        <w:t>argopy</w:t>
+        <w:t>so_dmqc_master_v</w:t>
       </w:r>
       <w:proofErr w:type="spellEnd"/>
       <w:r>
@@ -8486,53 +8401,7 @@
           <w:rFonts w:cstheme="minorHAnsi"/>
           <w:color w:val="000000" w:themeColor="text1"/>
         </w:rPr>
-        <w:t xml:space="preserve"> so the call</w:t>
-      </w:r>
-      <w:r>
-        <w:rPr>
-          <w:rFonts w:cstheme="minorHAnsi"/>
-          <w:color w:val="000000" w:themeColor="text1"/>
-        </w:rPr>
-        <w:t>-</w:t>
-      </w:r>
-      <w:r>
-        <w:rPr>
-          <w:rFonts w:cstheme="minorHAnsi"/>
-          <w:color w:val="000000" w:themeColor="text1"/>
-        </w:rPr>
-        <w:t>in line 72 of the “</w:t>
-      </w:r>
-      <w:proofErr w:type="spellStart"/>
-      <w:r>
-        <w:rPr>
-          <w:rFonts w:cstheme="minorHAnsi"/>
-          <w:color w:val="000000" w:themeColor="text1"/>
-        </w:rPr>
-        <w:t>so_dmqc_master_v</w:t>
-      </w:r>
-      <w:proofErr w:type="spellEnd"/>
-      <w:r>
-        <w:rPr>
-          <w:rFonts w:cstheme="minorHAnsi"/>
-          <w:color w:val="000000" w:themeColor="text1"/>
-        </w:rPr>
-        <w:t>&lt;&gt;</w:t>
-      </w:r>
-      <w:proofErr w:type="spellStart"/>
-      <w:r>
-        <w:rPr>
-          <w:rFonts w:cstheme="minorHAnsi"/>
-          <w:color w:val="000000" w:themeColor="text1"/>
-        </w:rPr>
-        <w:t>py</w:t>
-      </w:r>
-      <w:proofErr w:type="spellEnd"/>
-      <w:r>
-        <w:rPr>
-          <w:rFonts w:cstheme="minorHAnsi"/>
-          <w:color w:val="000000" w:themeColor="text1"/>
-        </w:rPr>
-        <w:t>” will need to be changed to “</w:t>
+        <w:t>&lt;&gt;py” will need to be changed to “</w:t>
       </w:r>
       <w:proofErr w:type="spellStart"/>
       <w:r>
@@ -8636,23 +8505,7 @@
           <w:rFonts w:cstheme="minorHAnsi"/>
           <w:color w:val="000000" w:themeColor="text1"/>
         </w:rPr>
-        <w:t xml:space="preserve"> the local mirror will not be able to be used. Please check for this on </w:t>
-      </w:r>
-      <w:proofErr w:type="spellStart"/>
-      <w:r>
-        <w:rPr>
-          <w:rFonts w:cstheme="minorHAnsi"/>
-          <w:color w:val="000000" w:themeColor="text1"/>
-        </w:rPr>
-        <w:t>argopy</w:t>
-      </w:r>
-      <w:proofErr w:type="spellEnd"/>
-      <w:r>
-        <w:rPr>
-          <w:rFonts w:cstheme="minorHAnsi"/>
-          <w:color w:val="000000" w:themeColor="text1"/>
-        </w:rPr>
-        <w:t xml:space="preserve"> documentation because the “</w:t>
+        <w:t xml:space="preserve"> the local mirror will not be able to be used. Please check for this on argopy documentation because the “</w:t>
       </w:r>
       <w:proofErr w:type="spellStart"/>
       <w:r>
@@ -11628,6 +11481,119 @@
     </w:lvl>
   </w:abstractNum>
   <w:abstractNum w:abstractNumId="24" w15:restartNumberingAfterBreak="0">
+    <w:nsid w:val="483320B6"/>
+    <w:multiLevelType w:val="multilevel"/>
+    <w:tmpl w:val="2BF813D0"/>
+    <w:lvl w:ilvl="0">
+      <w:start w:val="1"/>
+      <w:numFmt w:val="decimal"/>
+      <w:lvlText w:val="%1."/>
+      <w:lvlJc w:val="left"/>
+      <w:pPr>
+        <w:tabs>
+          <w:tab w:val="num" w:pos="720"/>
+        </w:tabs>
+        <w:ind w:left="720" w:hanging="360"/>
+      </w:pPr>
+    </w:lvl>
+    <w:lvl w:ilvl="1" w:tentative="1">
+      <w:start w:val="1"/>
+      <w:numFmt w:val="decimal"/>
+      <w:lvlText w:val="%2."/>
+      <w:lvlJc w:val="left"/>
+      <w:pPr>
+        <w:tabs>
+          <w:tab w:val="num" w:pos="1440"/>
+        </w:tabs>
+        <w:ind w:left="1440" w:hanging="360"/>
+      </w:pPr>
+    </w:lvl>
+    <w:lvl w:ilvl="2" w:tentative="1">
+      <w:start w:val="1"/>
+      <w:numFmt w:val="decimal"/>
+      <w:lvlText w:val="%3."/>
+      <w:lvlJc w:val="left"/>
+      <w:pPr>
+        <w:tabs>
+          <w:tab w:val="num" w:pos="2160"/>
+        </w:tabs>
+        <w:ind w:left="2160" w:hanging="360"/>
+      </w:pPr>
+    </w:lvl>
+    <w:lvl w:ilvl="3" w:tentative="1">
+      <w:start w:val="1"/>
+      <w:numFmt w:val="decimal"/>
+      <w:lvlText w:val="%4."/>
+      <w:lvlJc w:val="left"/>
+      <w:pPr>
+        <w:tabs>
+          <w:tab w:val="num" w:pos="2880"/>
+        </w:tabs>
+        <w:ind w:left="2880" w:hanging="360"/>
+      </w:pPr>
+    </w:lvl>
+    <w:lvl w:ilvl="4" w:tentative="1">
+      <w:start w:val="1"/>
+      <w:numFmt w:val="decimal"/>
+      <w:lvlText w:val="%5."/>
+      <w:lvlJc w:val="left"/>
+      <w:pPr>
+        <w:tabs>
+          <w:tab w:val="num" w:pos="3600"/>
+        </w:tabs>
+        <w:ind w:left="3600" w:hanging="360"/>
+      </w:pPr>
+    </w:lvl>
+    <w:lvl w:ilvl="5" w:tentative="1">
+      <w:start w:val="1"/>
+      <w:numFmt w:val="decimal"/>
+      <w:lvlText w:val="%6."/>
+      <w:lvlJc w:val="left"/>
+      <w:pPr>
+        <w:tabs>
+          <w:tab w:val="num" w:pos="4320"/>
+        </w:tabs>
+        <w:ind w:left="4320" w:hanging="360"/>
+      </w:pPr>
+    </w:lvl>
+    <w:lvl w:ilvl="6" w:tentative="1">
+      <w:start w:val="1"/>
+      <w:numFmt w:val="decimal"/>
+      <w:lvlText w:val="%7."/>
+      <w:lvlJc w:val="left"/>
+      <w:pPr>
+        <w:tabs>
+          <w:tab w:val="num" w:pos="5040"/>
+        </w:tabs>
+        <w:ind w:left="5040" w:hanging="360"/>
+      </w:pPr>
+    </w:lvl>
+    <w:lvl w:ilvl="7" w:tentative="1">
+      <w:start w:val="1"/>
+      <w:numFmt w:val="decimal"/>
+      <w:lvlText w:val="%8."/>
+      <w:lvlJc w:val="left"/>
+      <w:pPr>
+        <w:tabs>
+          <w:tab w:val="num" w:pos="5760"/>
+        </w:tabs>
+        <w:ind w:left="5760" w:hanging="360"/>
+      </w:pPr>
+    </w:lvl>
+    <w:lvl w:ilvl="8" w:tentative="1">
+      <w:start w:val="1"/>
+      <w:numFmt w:val="decimal"/>
+      <w:lvlText w:val="%9."/>
+      <w:lvlJc w:val="left"/>
+      <w:pPr>
+        <w:tabs>
+          <w:tab w:val="num" w:pos="6480"/>
+        </w:tabs>
+        <w:ind w:left="6480" w:hanging="360"/>
+      </w:pPr>
+    </w:lvl>
+  </w:abstractNum>
+  <w:abstractNum w:abstractNumId="25" w15:restartNumberingAfterBreak="0">
     <w:nsid w:val="487337A6"/>
     <w:multiLevelType w:val="multilevel"/>
     <w:tmpl w:val="3D263562"/>
@@ -11740,7 +11706,7 @@
       </w:rPr>
     </w:lvl>
   </w:abstractNum>
-  <w:abstractNum w:abstractNumId="25" w15:restartNumberingAfterBreak="0">
+  <w:abstractNum w:abstractNumId="26" w15:restartNumberingAfterBreak="0">
     <w:nsid w:val="4944717B"/>
     <w:multiLevelType w:val="multilevel"/>
     <w:tmpl w:val="3D263562"/>
@@ -11853,7 +11819,7 @@
       </w:rPr>
     </w:lvl>
   </w:abstractNum>
-  <w:abstractNum w:abstractNumId="26" w15:restartNumberingAfterBreak="0">
+  <w:abstractNum w:abstractNumId="27" w15:restartNumberingAfterBreak="0">
     <w:nsid w:val="4CA63E4F"/>
     <w:multiLevelType w:val="multilevel"/>
     <w:tmpl w:val="42BEE1E2"/>
@@ -12002,7 +11968,7 @@
       </w:rPr>
     </w:lvl>
   </w:abstractNum>
-  <w:abstractNum w:abstractNumId="27" w15:restartNumberingAfterBreak="0">
+  <w:abstractNum w:abstractNumId="28" w15:restartNumberingAfterBreak="0">
     <w:nsid w:val="549D643E"/>
     <w:multiLevelType w:val="multilevel"/>
     <w:tmpl w:val="D30C3304"/>
@@ -12124,7 +12090,7 @@
       </w:rPr>
     </w:lvl>
   </w:abstractNum>
-  <w:abstractNum w:abstractNumId="28" w15:restartNumberingAfterBreak="0">
+  <w:abstractNum w:abstractNumId="29" w15:restartNumberingAfterBreak="0">
     <w:nsid w:val="580A3FE9"/>
     <w:multiLevelType w:val="multilevel"/>
     <w:tmpl w:val="3B8A992C"/>
@@ -12237,7 +12203,7 @@
       </w:rPr>
     </w:lvl>
   </w:abstractNum>
-  <w:abstractNum w:abstractNumId="29" w15:restartNumberingAfterBreak="0">
+  <w:abstractNum w:abstractNumId="30" w15:restartNumberingAfterBreak="0">
     <w:nsid w:val="591966CB"/>
     <w:multiLevelType w:val="hybridMultilevel"/>
     <w:tmpl w:val="9250AA6A"/>
@@ -12350,7 +12316,7 @@
       </w:rPr>
     </w:lvl>
   </w:abstractNum>
-  <w:abstractNum w:abstractNumId="30" w15:restartNumberingAfterBreak="0">
+  <w:abstractNum w:abstractNumId="31" w15:restartNumberingAfterBreak="0">
     <w:nsid w:val="5B3D7E07"/>
     <w:multiLevelType w:val="multilevel"/>
     <w:tmpl w:val="3B8A992C"/>
@@ -12463,7 +12429,7 @@
       </w:rPr>
     </w:lvl>
   </w:abstractNum>
-  <w:abstractNum w:abstractNumId="31" w15:restartNumberingAfterBreak="0">
+  <w:abstractNum w:abstractNumId="32" w15:restartNumberingAfterBreak="0">
     <w:nsid w:val="5C58578A"/>
     <w:multiLevelType w:val="hybridMultilevel"/>
     <w:tmpl w:val="28129128"/>
@@ -12576,7 +12542,7 @@
       </w:rPr>
     </w:lvl>
   </w:abstractNum>
-  <w:abstractNum w:abstractNumId="32" w15:restartNumberingAfterBreak="0">
+  <w:abstractNum w:abstractNumId="33" w15:restartNumberingAfterBreak="0">
     <w:nsid w:val="66F63A64"/>
     <w:multiLevelType w:val="multilevel"/>
     <w:tmpl w:val="85DCEFD4"/>
@@ -12725,7 +12691,7 @@
       </w:rPr>
     </w:lvl>
   </w:abstractNum>
-  <w:abstractNum w:abstractNumId="33" w15:restartNumberingAfterBreak="0">
+  <w:abstractNum w:abstractNumId="34" w15:restartNumberingAfterBreak="0">
     <w:nsid w:val="6E074367"/>
     <w:multiLevelType w:val="multilevel"/>
     <w:tmpl w:val="34D436C2"/>
@@ -12838,7 +12804,7 @@
       </w:rPr>
     </w:lvl>
   </w:abstractNum>
-  <w:abstractNum w:abstractNumId="34" w15:restartNumberingAfterBreak="0">
+  <w:abstractNum w:abstractNumId="35" w15:restartNumberingAfterBreak="0">
     <w:nsid w:val="709427B9"/>
     <w:multiLevelType w:val="multilevel"/>
     <w:tmpl w:val="5CDE1F6E"/>
@@ -12951,7 +12917,7 @@
       </w:rPr>
     </w:lvl>
   </w:abstractNum>
-  <w:abstractNum w:abstractNumId="35" w15:restartNumberingAfterBreak="0">
+  <w:abstractNum w:abstractNumId="36" w15:restartNumberingAfterBreak="0">
     <w:nsid w:val="72A73236"/>
     <w:multiLevelType w:val="multilevel"/>
     <w:tmpl w:val="EE2A54B6"/>
@@ -13064,7 +13030,7 @@
       </w:rPr>
     </w:lvl>
   </w:abstractNum>
-  <w:abstractNum w:abstractNumId="36" w15:restartNumberingAfterBreak="0">
+  <w:abstractNum w:abstractNumId="37" w15:restartNumberingAfterBreak="0">
     <w:nsid w:val="78BF7C6F"/>
     <w:multiLevelType w:val="hybridMultilevel"/>
     <w:tmpl w:val="0C78C358"/>
@@ -13177,7 +13143,7 @@
       </w:rPr>
     </w:lvl>
   </w:abstractNum>
-  <w:abstractNum w:abstractNumId="37" w15:restartNumberingAfterBreak="0">
+  <w:abstractNum w:abstractNumId="38" w15:restartNumberingAfterBreak="0">
     <w:nsid w:val="78C021DF"/>
     <w:multiLevelType w:val="multilevel"/>
     <w:tmpl w:val="3D263562"/>
@@ -13290,7 +13256,7 @@
       </w:rPr>
     </w:lvl>
   </w:abstractNum>
-  <w:abstractNum w:abstractNumId="38" w15:restartNumberingAfterBreak="0">
+  <w:abstractNum w:abstractNumId="39" w15:restartNumberingAfterBreak="0">
     <w:nsid w:val="79A510D3"/>
     <w:multiLevelType w:val="multilevel"/>
     <w:tmpl w:val="237E0A92"/>
@@ -13439,7 +13405,7 @@
       </w:rPr>
     </w:lvl>
   </w:abstractNum>
-  <w:abstractNum w:abstractNumId="39" w15:restartNumberingAfterBreak="0">
+  <w:abstractNum w:abstractNumId="40" w15:restartNumberingAfterBreak="0">
     <w:nsid w:val="7BFF44CC"/>
     <w:multiLevelType w:val="multilevel"/>
     <w:tmpl w:val="27B6C436"/>
@@ -13588,7 +13554,7 @@
       </w:rPr>
     </w:lvl>
   </w:abstractNum>
-  <w:abstractNum w:abstractNumId="40" w15:restartNumberingAfterBreak="0">
+  <w:abstractNum w:abstractNumId="41" w15:restartNumberingAfterBreak="0">
     <w:nsid w:val="7E461799"/>
     <w:multiLevelType w:val="hybridMultilevel"/>
     <w:tmpl w:val="9BC8E6F4"/>
@@ -13678,7 +13644,7 @@
       </w:pPr>
     </w:lvl>
   </w:abstractNum>
-  <w:abstractNum w:abstractNumId="41" w15:restartNumberingAfterBreak="0">
+  <w:abstractNum w:abstractNumId="42" w15:restartNumberingAfterBreak="0">
     <w:nsid w:val="7F1C2F40"/>
     <w:multiLevelType w:val="hybridMultilevel"/>
     <w:tmpl w:val="C6CE5628"/>
@@ -13792,19 +13758,19 @@
     </w:lvl>
   </w:abstractNum>
   <w:num w:numId="1">
-    <w:abstractNumId w:val="33"/>
+    <w:abstractNumId w:val="34"/>
   </w:num>
   <w:num w:numId="2">
-    <w:abstractNumId w:val="40"/>
+    <w:abstractNumId w:val="41"/>
   </w:num>
   <w:num w:numId="3">
-    <w:abstractNumId w:val="35"/>
+    <w:abstractNumId w:val="36"/>
   </w:num>
   <w:num w:numId="4">
     <w:abstractNumId w:val="14"/>
   </w:num>
   <w:num w:numId="5">
-    <w:abstractNumId w:val="31"/>
+    <w:abstractNumId w:val="32"/>
   </w:num>
   <w:num w:numId="6">
     <w:abstractNumId w:val="17"/>
@@ -13822,7 +13788,7 @@
     <w:abstractNumId w:val="3"/>
   </w:num>
   <w:num w:numId="11">
-    <w:abstractNumId w:val="36"/>
+    <w:abstractNumId w:val="37"/>
   </w:num>
   <w:num w:numId="12">
     <w:abstractNumId w:val="21"/>
@@ -13834,28 +13800,28 @@
     <w:abstractNumId w:val="1"/>
   </w:num>
   <w:num w:numId="15">
-    <w:abstractNumId w:val="24"/>
+    <w:abstractNumId w:val="25"/>
   </w:num>
   <w:num w:numId="16">
     <w:abstractNumId w:val="0"/>
   </w:num>
   <w:num w:numId="17">
-    <w:abstractNumId w:val="37"/>
+    <w:abstractNumId w:val="38"/>
   </w:num>
   <w:num w:numId="18">
     <w:abstractNumId w:val="5"/>
   </w:num>
   <w:num w:numId="19">
-    <w:abstractNumId w:val="25"/>
+    <w:abstractNumId w:val="26"/>
   </w:num>
   <w:num w:numId="20">
-    <w:abstractNumId w:val="30"/>
+    <w:abstractNumId w:val="31"/>
   </w:num>
   <w:num w:numId="21">
-    <w:abstractNumId w:val="28"/>
+    <w:abstractNumId w:val="29"/>
   </w:num>
   <w:num w:numId="22">
-    <w:abstractNumId w:val="29"/>
+    <w:abstractNumId w:val="30"/>
   </w:num>
   <w:num w:numId="23">
     <w:abstractNumId w:val="13"/>
@@ -13867,7 +13833,7 @@
     <w:abstractNumId w:val="18"/>
   </w:num>
   <w:num w:numId="26">
-    <w:abstractNumId w:val="41"/>
+    <w:abstractNumId w:val="42"/>
   </w:num>
   <w:num w:numId="27">
     <w:abstractNumId w:val="7"/>
@@ -13885,7 +13851,7 @@
     <w:abstractNumId w:val="12"/>
   </w:num>
   <w:num w:numId="32">
-    <w:abstractNumId w:val="27"/>
+    <w:abstractNumId w:val="28"/>
   </w:num>
   <w:num w:numId="33">
     <w:abstractNumId w:val="9"/>
@@ -13900,22 +13866,25 @@
     <w:abstractNumId w:val="20"/>
   </w:num>
   <w:num w:numId="37">
-    <w:abstractNumId w:val="26"/>
+    <w:abstractNumId w:val="27"/>
   </w:num>
   <w:num w:numId="38">
     <w:abstractNumId w:val="16"/>
   </w:num>
   <w:num w:numId="39">
-    <w:abstractNumId w:val="34"/>
+    <w:abstractNumId w:val="35"/>
   </w:num>
   <w:num w:numId="40">
-    <w:abstractNumId w:val="38"/>
+    <w:abstractNumId w:val="39"/>
   </w:num>
   <w:num w:numId="41">
-    <w:abstractNumId w:val="39"/>
+    <w:abstractNumId w:val="40"/>
   </w:num>
   <w:num w:numId="42">
-    <w:abstractNumId w:val="32"/>
+    <w:abstractNumId w:val="33"/>
+  </w:num>
+  <w:num w:numId="43">
+    <w:abstractNumId w:val="24"/>
   </w:num>
   <w:numIdMacAtCleanup w:val="7"/>
 </w:numbering>
@@ -15086,7 +15055,7 @@
 </file>
 
 <file path=customXml/itemProps1.xml><?xml version="1.0" encoding="utf-8"?>
-<ds:datastoreItem xmlns:ds="http://schemas.openxmlformats.org/officeDocument/2006/customXml" ds:itemID="{00E10ED6-D853-4843-9E65-DC7F0B2FFFC6}">
+<ds:datastoreItem xmlns:ds="http://schemas.openxmlformats.org/officeDocument/2006/customXml" ds:itemID="{085CA2B2-DE91-4CD0-8FF1-64B777CDFF25}">
   <ds:schemaRefs>
     <ds:schemaRef ds:uri="http://schemas.openxmlformats.org/officeDocument/2006/bibliography"/>
   </ds:schemaRefs>

</xml_diff>